<commit_message>
AASP01 Grupos-Usuarios: correções de consistência e novos artefatos (GQA, índice, CAP)
Traz para a gallant a versão revisada do projeto AASP01, preservando o restante
do conteúdo da branch:

- Nomes conforme MAPA-ORG-001 (Cézar Velázquez, Abraão Oliveira, Renan Kioshi,
  Caroline Jenifer).
- Siglas de processo conforme CONV-ORG-001 (REQ, VV, ITP, GPR/GCO).
- Acentuação pt-BR completa, preservando código, endpoints, nomes de
  tabela/coluna e valores de enum.
- Remoção de placeholders do corpo; meta de cobertura unificada (80%).
- Registro de Adaptação com classificação de nível (Nível 2 — Padrão).
- Novos artefatos: GQA-AASP01-001 (auditoria intermediária; auditor
  independente Silvio Baroni), 00_INDICE-AASP01 (mapa de registros) e
  CAP-AASP01-001 (capacitação da equipe).
- 21 .docx regenerados; arquivo de lock do LibreOffice removido e padrão
  adicionado ao .gitignore. Datas preservadas (projeto em aberto).

https://claude.ai/code/session_01W7xi1Lg7namhZ84Y69RKdK
</commit_message>
<xml_diff>
--- a/mps-nivel-c/oficial/04_registros/AASP_Gerenciador/AASP01_Grupos-Usuarios/ADAP-AASP01-001_Registro-de-Adaptacao.docx
+++ b/mps-nivel-c/oficial/04_registros/AASP_Gerenciador/AASP01_Grupos-Usuarios/ADAP-AASP01-001_Registro-de-Adaptacao.docx
@@ -21,7 +21,7 @@
           <w:color w:val="003366"/>
           <w:sz w:val="36"/>
         </w:rPr>
-        <w:t>REGISTRO DE ADAPTACAO AO PROCESSO-PADRAO — AASP GERENCIADOR · GRUPOS DE USUARIOS</w:t>
+        <w:t>REGISTRO DE ADAPTAÇÃO AO PROCESSO-PADRÃO — AASP GERENCIADOR · GRUPOS DE USUÁRIOS</w:t>
       </w:r>
     </w:p>
     <w:p>
@@ -226,7 +226,7 @@
                 <w:i w:val="0"/>
                 <w:sz w:val="20"/>
               </w:rPr>
-              <w:t>Grupos de Usuarios — AASP Gerenciador</w:t>
+              <w:t>Grupos de Usuários — AASP Gerenciador</w:t>
             </w:r>
           </w:p>
         </w:tc>
@@ -282,7 +282,7 @@
                 <w:i w:val="0"/>
                 <w:sz w:val="20"/>
               </w:rPr>
-              <w:t>AASP — Associacao dos Advogados de Sao Paulo</w:t>
+              <w:t>AASP — Associação dos Advogados de São Paulo</w:t>
             </w:r>
           </w:p>
         </w:tc>
@@ -313,7 +313,7 @@
                 <w:i w:val="0"/>
                 <w:sz w:val="20"/>
               </w:rPr>
-              <w:t>Versao</w:t>
+              <w:t>Versão</w:t>
             </w:r>
           </w:p>
         </w:tc>
@@ -450,7 +450,7 @@
                 <w:i w:val="0"/>
                 <w:sz w:val="20"/>
               </w:rPr>
-              <w:t>Abraão</w:t>
+              <w:t>Abraão Oliveira</w:t>
             </w:r>
           </w:p>
         </w:tc>
@@ -506,7 +506,7 @@
                 <w:i w:val="0"/>
                 <w:sz w:val="20"/>
               </w:rPr>
-              <w:t>ADAP (evidencia de projeto)</w:t>
+              <w:t>ADAP (evidência de projeto)</w:t>
             </w:r>
           </w:p>
         </w:tc>
@@ -541,7 +541,7 @@
           <w:i w:val="0"/>
           <w:sz w:val="22"/>
         </w:rPr>
-        <w:t>Registrar formalmente as adaptacoes realizadas ao processo-padrao Timeware para a execucao do projeto AASP01 — Grupos de Usuarios (ms.auxo.gruposusuarios). As adaptacoes descritas neste documento foram avaliadas e aprovadas pelo Gerente de Projeto antes do inicio das atividades de desenvolvimento, conforme exigido pelo processo de Adaptacao (ADAP) do modelo MPS-SW nivel C.</w:t>
+        <w:t>Registrar formalmente as adaptações realizadas ao processo-padrão Timeware para a execução do projeto AASP01 — Grupos de Usuários (ms.auxo.gruposusuarios). As adaptações descritas neste documento foram avaliadas e aprovadas pelo Gerente de Projeto antes do início das atividades de desenvolvimento, conforme exigido pelo processo de Adaptação (ADAP) do modelo MPS-SW nível C.</w:t>
       </w:r>
     </w:p>
     <w:p>
@@ -555,7 +555,7 @@
           <w:i w:val="0"/>
           <w:sz w:val="22"/>
         </w:rPr>
-        <w:t>Toda adaptacao foi motivada por restricoes reais de contexto — equipe enxuta, legado nao documentado, restricoes do cliente — e nao implica reducao de qualidade nos produtos entregues. Os mecanismos de mitigacao associados a cada adaptacao garantem que os objetivos do processo-padrao sejam atingidos por meios alternativos.</w:t>
+        <w:t>Toda adaptação foi motivada por restrições reais de contexto — equipe enxuta, legado não documentado, restrições do cliente — e não implica redução de qualidade nos produtos entregues. Os mecanismos de mitigação associados a cada adaptação garantem que os objetivos do processo-padrão sejam atingidos por meios alternativos.</w:t>
       </w:r>
     </w:p>
     <w:p>
@@ -568,7 +568,719 @@
         </w:pBdr>
       </w:pPr>
       <w:r>
-        <w:t>2. Adaptacoes aplicadas</w:t>
+        <w:t>2. Nível de adaptação do projeto</w:t>
+      </w:r>
+    </w:p>
+    <w:p>
+      <w:pPr>
+        <w:spacing w:before="0" w:after="120"/>
+      </w:pPr>
+      <w:r>
+        <w:rPr>
+          <w:rFonts w:ascii="Calibri" w:hAnsi="Calibri"/>
+          <w:b w:val="0"/>
+          <w:i w:val="0"/>
+          <w:sz w:val="22"/>
+        </w:rPr>
+        <w:t xml:space="preserve">Conforme o Guia de Adaptação do Processo-Padrão (GUIA-GPC-001, §5), o projeto é classificado em um nível de adaptação a partir dos critérios de calibração, aplicando-se a regra do </w:t>
+      </w:r>
+      <w:r>
+        <w:rPr>
+          <w:rFonts w:ascii="Calibri" w:hAnsi="Calibri"/>
+          <w:b/>
+          <w:i w:val="0"/>
+          <w:sz w:val="22"/>
+        </w:rPr>
+        <w:t>nível mais alto atingido em qualquer critério</w:t>
+      </w:r>
+      <w:r>
+        <w:rPr>
+          <w:rFonts w:ascii="Calibri" w:hAnsi="Calibri"/>
+          <w:b w:val="0"/>
+          <w:i w:val="0"/>
+          <w:sz w:val="22"/>
+        </w:rPr>
+        <w:t>.</w:t>
+      </w:r>
+    </w:p>
+    <w:tbl>
+      <w:tblPr>
+        <w:tblW w:type="auto" w:w="0"/>
+        <w:tblLook w:firstColumn="1" w:firstRow="1" w:lastColumn="0" w:lastRow="0" w:noHBand="0" w:noVBand="1" w:val="04A0"/>
+        <w:tblBorders>
+          <w:top w:val="single" w:sz="4" w:space="0" w:color="003366"/>
+          <w:left w:val="single" w:sz="4" w:space="0" w:color="003366"/>
+          <w:bottom w:val="single" w:sz="4" w:space="0" w:color="003366"/>
+          <w:right w:val="single" w:sz="4" w:space="0" w:color="003366"/>
+          <w:insideH w:val="single" w:sz="4" w:space="0" w:color="003366"/>
+          <w:insideV w:val="single" w:sz="4" w:space="0" w:color="003366"/>
+        </w:tblBorders>
+      </w:tblPr>
+      <w:tblGrid>
+        <w:gridCol w:w="2967"/>
+        <w:gridCol w:w="2967"/>
+        <w:gridCol w:w="2967"/>
+      </w:tblGrid>
+      <w:tr>
+        <w:trPr>
+          <w:cantSplit w:val="1"/>
+        </w:trPr>
+        <w:tc>
+          <w:tcPr>
+            <w:tcW w:type="dxa" w:w="2967"/>
+            <w:tcMar>
+              <w:top w:w="60" w:type="dxa"/>
+              <w:bottom w:w="60" w:type="dxa"/>
+              <w:left w:w="100" w:type="dxa"/>
+              <w:right w:w="100" w:type="dxa"/>
+            </w:tcMar>
+            <w:shd w:val="clear" w:color="auto" w:fill="003366"/>
+          </w:tcPr>
+          <w:p>
+            <w:pPr>
+              <w:spacing w:before="40" w:after="40"/>
+            </w:pPr>
+            <w:r>
+              <w:rPr>
+                <w:rFonts w:ascii="Calibri" w:hAnsi="Calibri"/>
+                <w:b/>
+                <w:i w:val="0"/>
+                <w:color w:val="FFFFFF"/>
+                <w:sz w:val="20"/>
+              </w:rPr>
+              <w:t>Critério</w:t>
+            </w:r>
+          </w:p>
+        </w:tc>
+        <w:tc>
+          <w:tcPr>
+            <w:tcW w:type="dxa" w:w="2967"/>
+            <w:tcMar>
+              <w:top w:w="60" w:type="dxa"/>
+              <w:bottom w:w="60" w:type="dxa"/>
+              <w:left w:w="100" w:type="dxa"/>
+              <w:right w:w="100" w:type="dxa"/>
+            </w:tcMar>
+            <w:shd w:val="clear" w:color="auto" w:fill="003366"/>
+          </w:tcPr>
+          <w:p>
+            <w:pPr>
+              <w:spacing w:before="40" w:after="40"/>
+            </w:pPr>
+            <w:r>
+              <w:rPr>
+                <w:rFonts w:ascii="Calibri" w:hAnsi="Calibri"/>
+                <w:b/>
+                <w:i w:val="0"/>
+                <w:color w:val="FFFFFF"/>
+                <w:sz w:val="20"/>
+              </w:rPr>
+              <w:t>Situação do AASP01</w:t>
+            </w:r>
+          </w:p>
+        </w:tc>
+        <w:tc>
+          <w:tcPr>
+            <w:tcW w:type="dxa" w:w="2967"/>
+            <w:tcMar>
+              <w:top w:w="60" w:type="dxa"/>
+              <w:bottom w:w="60" w:type="dxa"/>
+              <w:left w:w="100" w:type="dxa"/>
+              <w:right w:w="100" w:type="dxa"/>
+            </w:tcMar>
+            <w:shd w:val="clear" w:color="auto" w:fill="003366"/>
+          </w:tcPr>
+          <w:p>
+            <w:pPr>
+              <w:spacing w:before="40" w:after="40"/>
+            </w:pPr>
+            <w:r>
+              <w:rPr>
+                <w:rFonts w:ascii="Calibri" w:hAnsi="Calibri"/>
+                <w:b/>
+                <w:i w:val="0"/>
+                <w:color w:val="FFFFFF"/>
+                <w:sz w:val="20"/>
+              </w:rPr>
+              <w:t>Nível</w:t>
+            </w:r>
+          </w:p>
+        </w:tc>
+      </w:tr>
+      <w:tr>
+        <w:trPr>
+          <w:cantSplit w:val="1"/>
+        </w:trPr>
+        <w:tc>
+          <w:tcPr>
+            <w:tcW w:type="dxa" w:w="2967"/>
+            <w:tcMar>
+              <w:top w:w="60" w:type="dxa"/>
+              <w:bottom w:w="60" w:type="dxa"/>
+              <w:left w:w="100" w:type="dxa"/>
+              <w:right w:w="100" w:type="dxa"/>
+            </w:tcMar>
+            <w:shd w:val="clear" w:color="auto" w:fill="EBF5FB"/>
+          </w:tcPr>
+          <w:p>
+            <w:pPr>
+              <w:spacing w:before="40" w:after="40"/>
+            </w:pPr>
+            <w:r>
+              <w:rPr>
+                <w:rFonts w:ascii="Calibri" w:hAnsi="Calibri"/>
+                <w:b w:val="0"/>
+                <w:i w:val="0"/>
+                <w:sz w:val="20"/>
+              </w:rPr>
+              <w:t>Duração</w:t>
+            </w:r>
+          </w:p>
+        </w:tc>
+        <w:tc>
+          <w:tcPr>
+            <w:tcW w:type="dxa" w:w="2967"/>
+            <w:tcMar>
+              <w:top w:w="60" w:type="dxa"/>
+              <w:bottom w:w="60" w:type="dxa"/>
+              <w:left w:w="100" w:type="dxa"/>
+              <w:right w:w="100" w:type="dxa"/>
+            </w:tcMar>
+            <w:shd w:val="clear" w:color="auto" w:fill="EBF5FB"/>
+          </w:tcPr>
+          <w:p>
+            <w:pPr>
+              <w:spacing w:before="40" w:after="40"/>
+            </w:pPr>
+            <w:r>
+              <w:rPr>
+                <w:rFonts w:ascii="Calibri" w:hAnsi="Calibri"/>
+                <w:b w:val="0"/>
+                <w:i w:val="0"/>
+                <w:sz w:val="20"/>
+              </w:rPr>
+              <w:t>~7 semanas (19/05 a 11/07/2026) — até 3 meses</w:t>
+            </w:r>
+          </w:p>
+        </w:tc>
+        <w:tc>
+          <w:tcPr>
+            <w:tcW w:type="dxa" w:w="2967"/>
+            <w:tcMar>
+              <w:top w:w="60" w:type="dxa"/>
+              <w:bottom w:w="60" w:type="dxa"/>
+              <w:left w:w="100" w:type="dxa"/>
+              <w:right w:w="100" w:type="dxa"/>
+            </w:tcMar>
+            <w:shd w:val="clear" w:color="auto" w:fill="EBF5FB"/>
+          </w:tcPr>
+          <w:p>
+            <w:pPr>
+              <w:spacing w:before="40" w:after="40"/>
+            </w:pPr>
+            <w:r>
+              <w:rPr>
+                <w:rFonts w:ascii="Calibri" w:hAnsi="Calibri"/>
+                <w:b w:val="0"/>
+                <w:i w:val="0"/>
+                <w:sz w:val="20"/>
+              </w:rPr>
+              <w:t>1</w:t>
+            </w:r>
+          </w:p>
+        </w:tc>
+      </w:tr>
+      <w:tr>
+        <w:trPr>
+          <w:cantSplit w:val="1"/>
+        </w:trPr>
+        <w:tc>
+          <w:tcPr>
+            <w:tcW w:type="dxa" w:w="2967"/>
+            <w:tcMar>
+              <w:top w:w="60" w:type="dxa"/>
+              <w:bottom w:w="60" w:type="dxa"/>
+              <w:left w:w="100" w:type="dxa"/>
+              <w:right w:w="100" w:type="dxa"/>
+            </w:tcMar>
+          </w:tcPr>
+          <w:p>
+            <w:pPr>
+              <w:spacing w:before="40" w:after="40"/>
+            </w:pPr>
+            <w:r>
+              <w:rPr>
+                <w:rFonts w:ascii="Calibri" w:hAnsi="Calibri"/>
+                <w:b w:val="0"/>
+                <w:i w:val="0"/>
+                <w:sz w:val="20"/>
+              </w:rPr>
+              <w:t>Tamanho da equipe</w:t>
+            </w:r>
+          </w:p>
+        </w:tc>
+        <w:tc>
+          <w:tcPr>
+            <w:tcW w:type="dxa" w:w="2967"/>
+            <w:tcMar>
+              <w:top w:w="60" w:type="dxa"/>
+              <w:bottom w:w="60" w:type="dxa"/>
+              <w:left w:w="100" w:type="dxa"/>
+              <w:right w:w="100" w:type="dxa"/>
+            </w:tcMar>
+          </w:tcPr>
+          <w:p>
+            <w:pPr>
+              <w:spacing w:before="40" w:after="40"/>
+            </w:pPr>
+            <w:r>
+              <w:rPr>
+                <w:rFonts w:ascii="Calibri" w:hAnsi="Calibri"/>
+                <w:b w:val="0"/>
+                <w:i w:val="0"/>
+                <w:sz w:val="20"/>
+              </w:rPr>
+              <w:t>5 pessoas (Gerente de Projeto, Tech Lead/Arquiteto e 3 desenvolvedores)</w:t>
+            </w:r>
+          </w:p>
+        </w:tc>
+        <w:tc>
+          <w:tcPr>
+            <w:tcW w:type="dxa" w:w="2967"/>
+            <w:tcMar>
+              <w:top w:w="60" w:type="dxa"/>
+              <w:bottom w:w="60" w:type="dxa"/>
+              <w:left w:w="100" w:type="dxa"/>
+              <w:right w:w="100" w:type="dxa"/>
+            </w:tcMar>
+          </w:tcPr>
+          <w:p>
+            <w:pPr>
+              <w:spacing w:before="40" w:after="40"/>
+            </w:pPr>
+            <w:r>
+              <w:rPr>
+                <w:rFonts w:ascii="Calibri" w:hAnsi="Calibri"/>
+                <w:b w:val="0"/>
+                <w:i w:val="0"/>
+                <w:sz w:val="20"/>
+              </w:rPr>
+              <w:t>2</w:t>
+            </w:r>
+          </w:p>
+        </w:tc>
+      </w:tr>
+      <w:tr>
+        <w:trPr>
+          <w:cantSplit w:val="1"/>
+        </w:trPr>
+        <w:tc>
+          <w:tcPr>
+            <w:tcW w:type="dxa" w:w="2967"/>
+            <w:tcMar>
+              <w:top w:w="60" w:type="dxa"/>
+              <w:bottom w:w="60" w:type="dxa"/>
+              <w:left w:w="100" w:type="dxa"/>
+              <w:right w:w="100" w:type="dxa"/>
+            </w:tcMar>
+            <w:shd w:val="clear" w:color="auto" w:fill="EBF5FB"/>
+          </w:tcPr>
+          <w:p>
+            <w:pPr>
+              <w:spacing w:before="40" w:after="40"/>
+            </w:pPr>
+            <w:r>
+              <w:rPr>
+                <w:rFonts w:ascii="Calibri" w:hAnsi="Calibri"/>
+                <w:b w:val="0"/>
+                <w:i w:val="0"/>
+                <w:sz w:val="20"/>
+              </w:rPr>
+              <w:t>Complexidade técnica</w:t>
+            </w:r>
+          </w:p>
+        </w:tc>
+        <w:tc>
+          <w:tcPr>
+            <w:tcW w:type="dxa" w:w="2967"/>
+            <w:tcMar>
+              <w:top w:w="60" w:type="dxa"/>
+              <w:bottom w:w="60" w:type="dxa"/>
+              <w:left w:w="100" w:type="dxa"/>
+              <w:right w:w="100" w:type="dxa"/>
+            </w:tcMar>
+            <w:shd w:val="clear" w:color="auto" w:fill="EBF5FB"/>
+          </w:tcPr>
+          <w:p>
+            <w:pPr>
+              <w:spacing w:before="40" w:after="40"/>
+            </w:pPr>
+            <w:r>
+              <w:rPr>
+                <w:rFonts w:ascii="Calibri" w:hAnsi="Calibri"/>
+                <w:b w:val="0"/>
+                <w:i w:val="0"/>
+                <w:sz w:val="20"/>
+              </w:rPr>
+              <w:t>Média — microsserviço REST com RBAC, auditoria e integração com o ms.temis.vinculos sobre banco legado (auxo3)</w:t>
+            </w:r>
+          </w:p>
+        </w:tc>
+        <w:tc>
+          <w:tcPr>
+            <w:tcW w:type="dxa" w:w="2967"/>
+            <w:tcMar>
+              <w:top w:w="60" w:type="dxa"/>
+              <w:bottom w:w="60" w:type="dxa"/>
+              <w:left w:w="100" w:type="dxa"/>
+              <w:right w:w="100" w:type="dxa"/>
+            </w:tcMar>
+            <w:shd w:val="clear" w:color="auto" w:fill="EBF5FB"/>
+          </w:tcPr>
+          <w:p>
+            <w:pPr>
+              <w:spacing w:before="40" w:after="40"/>
+            </w:pPr>
+            <w:r>
+              <w:rPr>
+                <w:rFonts w:ascii="Calibri" w:hAnsi="Calibri"/>
+                <w:b w:val="0"/>
+                <w:i w:val="0"/>
+                <w:sz w:val="20"/>
+              </w:rPr>
+              <w:t>2</w:t>
+            </w:r>
+          </w:p>
+        </w:tc>
+      </w:tr>
+      <w:tr>
+        <w:trPr>
+          <w:cantSplit w:val="1"/>
+        </w:trPr>
+        <w:tc>
+          <w:tcPr>
+            <w:tcW w:type="dxa" w:w="2967"/>
+            <w:tcMar>
+              <w:top w:w="60" w:type="dxa"/>
+              <w:bottom w:w="60" w:type="dxa"/>
+              <w:left w:w="100" w:type="dxa"/>
+              <w:right w:w="100" w:type="dxa"/>
+            </w:tcMar>
+          </w:tcPr>
+          <w:p>
+            <w:pPr>
+              <w:spacing w:before="40" w:after="40"/>
+            </w:pPr>
+            <w:r>
+              <w:rPr>
+                <w:rFonts w:ascii="Calibri" w:hAnsi="Calibri"/>
+                <w:b w:val="0"/>
+                <w:i w:val="0"/>
+                <w:sz w:val="20"/>
+              </w:rPr>
+              <w:t>Criticidade / SLA contratual</w:t>
+            </w:r>
+          </w:p>
+        </w:tc>
+        <w:tc>
+          <w:tcPr>
+            <w:tcW w:type="dxa" w:w="2967"/>
+            <w:tcMar>
+              <w:top w:w="60" w:type="dxa"/>
+              <w:bottom w:w="60" w:type="dxa"/>
+              <w:left w:w="100" w:type="dxa"/>
+              <w:right w:w="100" w:type="dxa"/>
+            </w:tcMar>
+          </w:tcPr>
+          <w:p>
+            <w:pPr>
+              <w:spacing w:before="40" w:after="40"/>
+            </w:pPr>
+            <w:r>
+              <w:rPr>
+                <w:rFonts w:ascii="Calibri" w:hAnsi="Calibri"/>
+                <w:b w:val="0"/>
+                <w:i w:val="0"/>
+                <w:sz w:val="20"/>
+              </w:rPr>
+              <w:t>Sem SLA contratual rígido</w:t>
+            </w:r>
+          </w:p>
+        </w:tc>
+        <w:tc>
+          <w:tcPr>
+            <w:tcW w:type="dxa" w:w="2967"/>
+            <w:tcMar>
+              <w:top w:w="60" w:type="dxa"/>
+              <w:bottom w:w="60" w:type="dxa"/>
+              <w:left w:w="100" w:type="dxa"/>
+              <w:right w:w="100" w:type="dxa"/>
+            </w:tcMar>
+          </w:tcPr>
+          <w:p>
+            <w:pPr>
+              <w:spacing w:before="40" w:after="40"/>
+            </w:pPr>
+            <w:r>
+              <w:rPr>
+                <w:rFonts w:ascii="Calibri" w:hAnsi="Calibri"/>
+                <w:b w:val="0"/>
+                <w:i w:val="0"/>
+                <w:sz w:val="20"/>
+              </w:rPr>
+              <w:t>1</w:t>
+            </w:r>
+          </w:p>
+        </w:tc>
+      </w:tr>
+      <w:tr>
+        <w:trPr>
+          <w:cantSplit w:val="1"/>
+        </w:trPr>
+        <w:tc>
+          <w:tcPr>
+            <w:tcW w:type="dxa" w:w="2967"/>
+            <w:tcMar>
+              <w:top w:w="60" w:type="dxa"/>
+              <w:bottom w:w="60" w:type="dxa"/>
+              <w:left w:w="100" w:type="dxa"/>
+              <w:right w:w="100" w:type="dxa"/>
+            </w:tcMar>
+            <w:shd w:val="clear" w:color="auto" w:fill="EBF5FB"/>
+          </w:tcPr>
+          <w:p>
+            <w:pPr>
+              <w:spacing w:before="40" w:after="40"/>
+            </w:pPr>
+            <w:r>
+              <w:rPr>
+                <w:rFonts w:ascii="Calibri" w:hAnsi="Calibri"/>
+                <w:b w:val="0"/>
+                <w:i w:val="0"/>
+                <w:sz w:val="20"/>
+              </w:rPr>
+              <w:t>Regulação / compliance</w:t>
+            </w:r>
+          </w:p>
+        </w:tc>
+        <w:tc>
+          <w:tcPr>
+            <w:tcW w:type="dxa" w:w="2967"/>
+            <w:tcMar>
+              <w:top w:w="60" w:type="dxa"/>
+              <w:bottom w:w="60" w:type="dxa"/>
+              <w:left w:w="100" w:type="dxa"/>
+              <w:right w:w="100" w:type="dxa"/>
+            </w:tcMar>
+            <w:shd w:val="clear" w:color="auto" w:fill="EBF5FB"/>
+          </w:tcPr>
+          <w:p>
+            <w:pPr>
+              <w:spacing w:before="40" w:after="40"/>
+            </w:pPr>
+            <w:r>
+              <w:rPr>
+                <w:rFonts w:ascii="Calibri" w:hAnsi="Calibri"/>
+                <w:b w:val="0"/>
+                <w:i w:val="0"/>
+                <w:sz w:val="20"/>
+              </w:rPr>
+              <w:t>Dados de usuários e permissões (LGPD básico); sem regulação setorial</w:t>
+            </w:r>
+          </w:p>
+        </w:tc>
+        <w:tc>
+          <w:tcPr>
+            <w:tcW w:type="dxa" w:w="2967"/>
+            <w:tcMar>
+              <w:top w:w="60" w:type="dxa"/>
+              <w:bottom w:w="60" w:type="dxa"/>
+              <w:left w:w="100" w:type="dxa"/>
+              <w:right w:w="100" w:type="dxa"/>
+            </w:tcMar>
+            <w:shd w:val="clear" w:color="auto" w:fill="EBF5FB"/>
+          </w:tcPr>
+          <w:p>
+            <w:pPr>
+              <w:spacing w:before="40" w:after="40"/>
+            </w:pPr>
+            <w:r>
+              <w:rPr>
+                <w:rFonts w:ascii="Calibri" w:hAnsi="Calibri"/>
+                <w:b w:val="0"/>
+                <w:i w:val="0"/>
+                <w:sz w:val="20"/>
+              </w:rPr>
+              <w:t>1</w:t>
+            </w:r>
+          </w:p>
+        </w:tc>
+      </w:tr>
+    </w:tbl>
+    <w:p>
+      <w:pPr>
+        <w:spacing w:before="0" w:after="160"/>
+      </w:pPr>
+    </w:p>
+    <w:p>
+      <w:pPr>
+        <w:spacing w:before="0" w:after="120"/>
+      </w:pPr>
+      <w:r>
+        <w:rPr>
+          <w:rFonts w:ascii="Calibri" w:hAnsi="Calibri"/>
+          <w:b/>
+          <w:i w:val="0"/>
+          <w:sz w:val="22"/>
+        </w:rPr>
+        <w:t>Nível resultante: 2 — Padrão.</w:t>
+      </w:r>
+    </w:p>
+    <w:p>
+      <w:pPr>
+        <w:spacing w:before="0" w:after="120"/>
+      </w:pPr>
+      <w:r>
+        <w:rPr>
+          <w:rFonts w:ascii="Calibri" w:hAnsi="Calibri"/>
+          <w:b w:val="0"/>
+          <w:i w:val="0"/>
+          <w:sz w:val="22"/>
+        </w:rPr>
+        <w:t>Decorrências do Nível 2 (GUIA-GPC-001, §5.2), coerentes com os produtos de trabalho gerados no projeto:</w:t>
+      </w:r>
+    </w:p>
+    <w:p>
+      <w:pPr>
+        <w:pStyle w:val="ListBullet"/>
+        <w:spacing w:before="20" w:after="40"/>
+      </w:pPr>
+      <w:r>
+        <w:rPr>
+          <w:rFonts w:ascii="Calibri" w:hAnsi="Calibri"/>
+          <w:b/>
+          <w:i w:val="0"/>
+          <w:sz w:val="22"/>
+        </w:rPr>
+        <w:t>Requisitos:</w:t>
+      </w:r>
+      <w:r>
+        <w:rPr>
+          <w:rFonts w:ascii="Calibri" w:hAnsi="Calibri"/>
+          <w:b w:val="0"/>
+          <w:i w:val="0"/>
+          <w:sz w:val="22"/>
+        </w:rPr>
+        <w:t xml:space="preserve"> Documento de Requisitos completo (REQ-AASP01-001).</w:t>
+      </w:r>
+    </w:p>
+    <w:p>
+      <w:pPr>
+        <w:pStyle w:val="ListBullet"/>
+        <w:spacing w:before="20" w:after="40"/>
+      </w:pPr>
+      <w:r>
+        <w:rPr>
+          <w:rFonts w:ascii="Calibri" w:hAnsi="Calibri"/>
+          <w:b/>
+          <w:i w:val="0"/>
+          <w:sz w:val="22"/>
+        </w:rPr>
+        <w:t>Design técnico:</w:t>
+      </w:r>
+      <w:r>
+        <w:rPr>
+          <w:rFonts w:ascii="Calibri" w:hAnsi="Calibri"/>
+          <w:b w:val="0"/>
+          <w:i w:val="0"/>
+          <w:sz w:val="22"/>
+        </w:rPr>
+        <w:t xml:space="preserve"> Documento de Design completo (PCP-AASP01-001).</w:t>
+      </w:r>
+    </w:p>
+    <w:p>
+      <w:pPr>
+        <w:pStyle w:val="ListBullet"/>
+        <w:spacing w:before="20" w:after="40"/>
+      </w:pPr>
+      <w:r>
+        <w:rPr>
+          <w:rFonts w:ascii="Calibri" w:hAnsi="Calibri"/>
+          <w:b/>
+          <w:i w:val="0"/>
+          <w:sz w:val="22"/>
+        </w:rPr>
+        <w:t>Verificação e Validação:</w:t>
+      </w:r>
+      <w:r>
+        <w:rPr>
+          <w:rFonts w:ascii="Calibri" w:hAnsi="Calibri"/>
+          <w:b w:val="0"/>
+          <w:i w:val="0"/>
+          <w:sz w:val="22"/>
+        </w:rPr>
+        <w:t xml:space="preserve"> Plano de V&amp;V com execução registrada (VV-AASP01-001, REL-VV-AASP01-001).</w:t>
+      </w:r>
+    </w:p>
+    <w:p>
+      <w:pPr>
+        <w:pStyle w:val="ListBullet"/>
+        <w:spacing w:before="20" w:after="40"/>
+      </w:pPr>
+      <w:r>
+        <w:rPr>
+          <w:rFonts w:ascii="Calibri" w:hAnsi="Calibri"/>
+          <w:b/>
+          <w:i w:val="0"/>
+          <w:sz w:val="22"/>
+        </w:rPr>
+        <w:t>Gerência de Projetos:</w:t>
+      </w:r>
+      <w:r>
+        <w:rPr>
+          <w:rFonts w:ascii="Calibri" w:hAnsi="Calibri"/>
+          <w:b w:val="0"/>
+          <w:i w:val="0"/>
+          <w:sz w:val="22"/>
+        </w:rPr>
+        <w:t xml:space="preserve"> Plano de Projeto completo com Relatório de Acompanhamento periódico (PLA-AASP01-001, RAC-AASP01-001).</w:t>
+      </w:r>
+    </w:p>
+    <w:p>
+      <w:pPr>
+        <w:pStyle w:val="ListBullet"/>
+        <w:spacing w:before="20" w:after="40"/>
+      </w:pPr>
+      <w:r>
+        <w:rPr>
+          <w:rFonts w:ascii="Calibri" w:hAnsi="Calibri"/>
+          <w:b/>
+          <w:i w:val="0"/>
+          <w:sz w:val="22"/>
+        </w:rPr>
+        <w:t>GQA:</w:t>
+      </w:r>
+      <w:r>
+        <w:rPr>
+          <w:rFonts w:ascii="Calibri" w:hAnsi="Calibri"/>
+          <w:b w:val="0"/>
+          <w:i w:val="0"/>
+          <w:sz w:val="22"/>
+        </w:rPr>
+        <w:t xml:space="preserve"> uma auditoria intermediária e a auditoria de encerramento. A verificação intermediária está registrada em GQA-AASP01-001; a auditoria de encerramento ocorrerá na Sprint 4, junto ao Termo de Encerramento.</w:t>
+      </w:r>
+    </w:p>
+    <w:p>
+      <w:pPr>
+        <w:pStyle w:val="Heading1"/>
+        <w:keepNext/>
+        <w:keepLines/>
+        <w:pBdr>
+          <w:bottom w:val="single" w:sz="4" w:space="2" w:color="D6E4F0"/>
+        </w:pBdr>
+      </w:pPr>
+      <w:r>
+        <w:t>3. Adaptações aplicadas</w:t>
       </w:r>
     </w:p>
     <w:tbl>
@@ -644,7 +1356,7 @@
                 <w:color w:val="FFFFFF"/>
                 <w:sz w:val="20"/>
               </w:rPr>
-              <w:t>Item do processo-padrao</w:t>
+              <w:t>Item do processo-padrão</w:t>
             </w:r>
           </w:p>
         </w:tc>
@@ -671,7 +1383,7 @@
                 <w:color w:val="FFFFFF"/>
                 <w:sz w:val="20"/>
               </w:rPr>
-              <w:t>Decisao de adaptacao</w:t>
+              <w:t>Decisão de adaptação</w:t>
             </w:r>
           </w:p>
         </w:tc>
@@ -755,7 +1467,7 @@
                 <w:i w:val="0"/>
                 <w:sz w:val="20"/>
               </w:rPr>
-              <w:t>Definicao completa de requisitos antes do inicio do desenvolvimento</w:t>
+              <w:t>Definição completa de requisitos antes do início do desenvolvimento</w:t>
             </w:r>
           </w:p>
         </w:tc>
@@ -807,7 +1519,7 @@
                 <w:i w:val="0"/>
                 <w:sz w:val="20"/>
               </w:rPr>
-              <w:t>Banco auxo3 legado com schema nao documentado; requisitos precisaram ser descobertos explorando o banco e o codigo existente do Gerenciador. Impossivel elicitar todos os requisitos upfront sem acesso ao ambiente de producao.</w:t>
+              <w:t>Banco auxo3 legado com schema não documentado; requisitos precisaram ser descobertos explorando o banco e o código existente do Gerenciador. Impossível elicitar todos os requisitos upfront sem acesso ao ambiente de produção.</w:t>
             </w:r>
           </w:p>
         </w:tc>
@@ -862,7 +1574,7 @@
                 <w:i w:val="0"/>
                 <w:sz w:val="20"/>
               </w:rPr>
-              <w:t>Sprint Planning formal documentada desde o inicio do projeto</w:t>
+              <w:t>Sprint Planning formal documentada desde o início do projeto</w:t>
             </w:r>
           </w:p>
         </w:tc>
@@ -887,7 +1599,7 @@
                 <w:i w:val="0"/>
                 <w:sz w:val="20"/>
               </w:rPr>
-              <w:t>Sprints S1 e S2 conduzidas com planejamento agil via Microsoft Teams e notas informais; formalizacao completa a partir da S3</w:t>
+              <w:t>Sprints S1 e S2 conduzidas com planejamento ágil via Microsoft Teams e notas informais; formalização completa a partir da S3</w:t>
             </w:r>
           </w:p>
         </w:tc>
@@ -912,7 +1624,7 @@
                 <w:i w:val="0"/>
                 <w:sz w:val="20"/>
               </w:rPr>
-              <w:t>Equipe enxuta composta por 3 desenvolvedores (Renan Kiyoshi, Henry Komatsu e Mateus Veloso); overhead documental de um planning formal nas primeiras sprints comprometia a cadencia de entrega dentro do prazo contratado.</w:t>
+              <w:t>Equipe enxuta composta por 3 desenvolvedores (Renan Kioshi, Henry Komatsu e Mateus Veloso); overhead documental de um planning formal nas primeiras sprints comprometia a cadência de entrega dentro do prazo contratado.</w:t>
             </w:r>
           </w:p>
         </w:tc>
@@ -969,7 +1681,7 @@
                 <w:i w:val="0"/>
                 <w:sz w:val="20"/>
               </w:rPr>
-              <w:t>Design de integracao completo antes da implementacao</w:t>
+              <w:t>Design de integração completo antes da implementação</w:t>
             </w:r>
           </w:p>
         </w:tc>
@@ -995,7 +1707,7 @@
                 <w:i w:val="0"/>
                 <w:sz w:val="20"/>
               </w:rPr>
-              <w:t>Plano de Integracao (ITP-AASP01-001) definido iterativamente; detalhes do contrato de API acordados no inicio da Sprint 2</w:t>
+              <w:t>Plano de Integração (ITP-AASP01-001) definido iterativamente; detalhes do contrato de API acordados no início da Sprint 2</w:t>
             </w:r>
           </w:p>
         </w:tc>
@@ -1021,7 +1733,7 @@
                 <w:i w:val="0"/>
                 <w:sz w:val="20"/>
               </w:rPr>
-              <w:t>O contrato de API do microsservico ms.temis.vinculos (banco temis3) foi disponibilizado pelo time do cliente somente no inicio da Sprint 2 (09/06/2026); especificacao previa seria baseada em suposicoes sem validade.</w:t>
+              <w:t>O contrato de API do microsserviço ms.temis.vinculos (banco temis3) foi disponibilizado pelo time do cliente somente no início da Sprint 2 (09/06/2026); especificação prévia seria baseada em suposições sem validade.</w:t>
             </w:r>
           </w:p>
         </w:tc>
@@ -1076,7 +1788,7 @@
                 <w:i w:val="0"/>
                 <w:sz w:val="20"/>
               </w:rPr>
-              <w:t>Ambiente de homologacao independente desde o inicio do projeto</w:t>
+              <w:t>Ambiente de homologação independente desde o início do projeto</w:t>
             </w:r>
           </w:p>
         </w:tc>
@@ -1101,7 +1813,7 @@
                 <w:i w:val="0"/>
                 <w:sz w:val="20"/>
               </w:rPr>
-              <w:t>Ambiente de homologacao AASP disponibilizado somente a partir da Sprint 2 (09/06/2026); Sprint 1 executada com banco local SQL Server Express</w:t>
+              <w:t>Ambiente de homologação AASP disponibilizado somente a partir da Sprint 2 (09/06/2026); Sprint 1 executada com banco local SQL Server Express</w:t>
             </w:r>
           </w:p>
         </w:tc>
@@ -1126,7 +1838,7 @@
                 <w:i w:val="0"/>
                 <w:sz w:val="20"/>
               </w:rPr>
-              <w:t>Restricao imposta pelo cliente AASP; o time da AASP precisava preparar o ambiente de homologacao em paralelo ao desenvolvimento. O time Timeware trabalhou com instancia local para nao bloquear entregas.</w:t>
+              <w:t>Restrição imposta pelo cliente AASP; o time da AASP precisava preparar o ambiente de homologação em paralelo ao desenvolvimento. O time Timeware trabalhou com instância local para não bloquear entregas.</w:t>
             </w:r>
           </w:p>
         </w:tc>
@@ -1209,7 +1921,7 @@
                 <w:i w:val="0"/>
                 <w:sz w:val="20"/>
               </w:rPr>
-              <w:t>Co-responsabilidade nos testes de aceite: Caroline Sousa (QA Timeware) + Leonardo Francisco Pereira (QA AASP); roteiros revisados e executados em conjunto</w:t>
+              <w:t>Co-responsabilidade nos testes de aceite: Caroline Jenifer (QA Timeware) + Leonardo Francisco Pereira (QA AASP); roteiros revisados e executados em conjunto</w:t>
             </w:r>
           </w:p>
         </w:tc>
@@ -1235,7 +1947,7 @@
                 <w:i w:val="0"/>
                 <w:sz w:val="20"/>
               </w:rPr>
-              <w:t>Cliente AASP exigiu participacao direta nos testes de aceite como condicao contratual. Os roteiros foram revisados em conjunto (CTQ-AASP01-001) e os resultados registrados formalmente (REL-VV-AASP01-001).</w:t>
+              <w:t>Cliente AASP exigiu participação direta nos testes de aceite como condição contratual. Os roteiros foram revisados em conjunto (CTQ-AASP01-001) e os resultados registrados formalmente (REL-VV-AASP01-001).</w:t>
             </w:r>
           </w:p>
         </w:tc>
@@ -1290,7 +2002,7 @@
                 <w:i w:val="0"/>
                 <w:sz w:val="20"/>
               </w:rPr>
-              <w:t>Plano de Construcao e Producao (PCP) com especificacoes de baixo nivel completas antes do desenvolvimento</w:t>
+              <w:t>Plano de Construção e Produção (PCP) com especificações de baixo nível completas antes do desenvolvimento</w:t>
             </w:r>
           </w:p>
         </w:tc>
@@ -1315,7 +2027,7 @@
                 <w:i w:val="0"/>
                 <w:sz w:val="20"/>
               </w:rPr>
-              <w:t>PCP elaborado no nivel de decisoes arquiteturais e padroes de implementacao; detalhes de baixo nivel registrados nos Pull Requests #11 a #15</w:t>
+              <w:t>PCP elaborado no nível de decisões arquiteturais e padrões de implementação; detalhes de baixo nível registrados nos Pull Requests #11 a #15</w:t>
             </w:r>
           </w:p>
         </w:tc>
@@ -1340,7 +2052,7 @@
                 <w:i w:val="0"/>
                 <w:sz w:val="20"/>
               </w:rPr>
-              <w:t>Equipe enxuta; duplicar especificacoes de baixo nivel no PCP e nos PRs geraria retrabalho documental sem agregar valor. Os PRs do Azure DevOps servem como documentacao viva, rastreavel e revisada.</w:t>
+              <w:t>Equipe enxuta; duplicar especificações de baixo nível no PCP e nos PRs geraria retrabalho documental sem agregar valor. Os PRs do Azure DevOps servem como documentação viva, rastreável e revisada.</w:t>
             </w:r>
           </w:p>
         </w:tc>
@@ -1423,7 +2135,7 @@
                 <w:i w:val="0"/>
                 <w:sz w:val="20"/>
               </w:rPr>
-              <w:t>Revisor unico (Cezar Hiraki como Tech Lead) nos PRs de codigo critico; revisao cruzada entre os desenvolvedores (Renan, Henry e Mateus Veloso) nos PRs de menor risco</w:t>
+              <w:t>Revisor único (Cézar Velázquez como Tech Lead) nos PRs de código crítico; revisão cruzada entre os desenvolvedores (Renan, Henry e Mateus Veloso) nos PRs de menor risco</w:t>
             </w:r>
           </w:p>
         </w:tc>
@@ -1449,7 +2161,7 @@
                 <w:i w:val="0"/>
                 <w:sz w:val="20"/>
               </w:rPr>
-              <w:t>Equipe de 3 desenvolvedores; exigir dois revisores independentes inviabilizaria o fluxo de trabalho. Cezar Hiraki revisa todos os PRs dos desenvolvedores. Gate de CI/CD obrigatorio compensa parcialmente a reducao de revisores.</w:t>
+              <w:t>Equipe de 3 desenvolvedores; exigir dois revisores independentes inviabilizaria o fluxo de trabalho. Cézar Velázquez revisa todos os PRs dos desenvolvedores. Gate de CI/CD obrigatório compensa parcialmente a redução de revisores.</w:t>
             </w:r>
           </w:p>
         </w:tc>
@@ -1529,7 +2241,7 @@
                 <w:i w:val="0"/>
                 <w:sz w:val="20"/>
               </w:rPr>
-              <w:t>Cezar Hiraki acumula os papeis de Arquiteto, Tech Lead, DevOps, Revisor e GCO; a Gerencia de Projeto e exercida por Abraão</w:t>
+              <w:t>Cézar Velázquez acumula os papeis de Arquiteto, Tech Lead, DevOps, Revisor e GCO; a Gerência de Projeto e exercida por Abraão Oliveira</w:t>
             </w:r>
           </w:p>
         </w:tc>
@@ -1554,7 +2266,7 @@
                 <w:i w:val="0"/>
                 <w:sz w:val="20"/>
               </w:rPr>
-              <w:t>Contrato previsto para equipe enxuta de desenvolvimento; acumulo de papeis por Cezar Hiraki viabiliza a operacao dentro do orçamento contratado. As responsabilidades de cada papel sao exercidas formalmente, ainda que pela mesma pessoa.</w:t>
+              <w:t>Contrato previsto para equipe enxuta de desenvolvimento; acumulo de papeis por Cézar Velázquez viabiliza a operação dentro do orçamento contratado. As responsabilidades de cada papel são exercidas formalmente, ainda que pela mesma pessoa.</w:t>
             </w:r>
           </w:p>
         </w:tc>
@@ -1575,7 +2287,7 @@
         </w:pBdr>
       </w:pPr>
       <w:r>
-        <w:t>3. Itens sem adaptacao (processo-padrao mantido integralmente)</w:t>
+        <w:t>4. Itens sem adaptação (processo-padrão mantido integralmente)</w:t>
       </w:r>
     </w:p>
     <w:p>
@@ -1589,7 +2301,7 @@
           <w:i w:val="0"/>
           <w:sz w:val="22"/>
         </w:rPr>
-        <w:t>Os itens abaixo seguiram o processo-padrao Timeware sem qualquer adaptacao:</w:t>
+        <w:t>Os itens abaixo seguiram o processo-padrão Timeware sem qualquer adaptação:</w:t>
       </w:r>
     </w:p>
     <w:p>
@@ -1604,7 +2316,7 @@
           <w:i w:val="0"/>
           <w:sz w:val="22"/>
         </w:rPr>
-        <w:t>Controle de versao com Git</w:t>
+        <w:t>Controle de versão com Git</w:t>
       </w:r>
       <w:r>
         <w:rPr>
@@ -1613,7 +2325,7 @@
           <w:i w:val="0"/>
           <w:sz w:val="22"/>
         </w:rPr>
-        <w:t>: todo codigo versionado no Azure DevOps; branching Git Flow (main / develop / feature/ag-{id} / release/*) aplicado desde o primeiro commit.</w:t>
+        <w:t>: todo código versionado no Azure DevOps; branching Git Flow (main / develop / feature/ag-{id} / release/*) aplicado desde o primeiro commit.</w:t>
       </w:r>
     </w:p>
     <w:p>
@@ -1628,7 +2340,7 @@
           <w:i w:val="0"/>
           <w:sz w:val="22"/>
         </w:rPr>
-        <w:t>Pull Request obrigatorio para merge</w:t>
+        <w:t>Pull Request obrigatório para merge</w:t>
       </w:r>
       <w:r>
         <w:rPr>
@@ -1637,7 +2349,7 @@
           <w:i w:val="0"/>
           <w:sz w:val="22"/>
         </w:rPr>
-        <w:t>: nenhum codigo integrado a develop ou main sem PR aprovado, independentemente do tamanho da mudanca.</w:t>
+        <w:t>: nenhum código integrado a develop ou main sem PR aprovado, independentemente do tamanho da mudança.</w:t>
       </w:r>
     </w:p>
     <w:p>
@@ -1652,7 +2364,7 @@
           <w:i w:val="0"/>
           <w:sz w:val="22"/>
         </w:rPr>
-        <w:t>Testes unitarios como gate de CI</w:t>
+        <w:t>Testes unitários como gate de CI</w:t>
       </w:r>
       <w:r>
         <w:rPr>
@@ -1661,7 +2373,7 @@
           <w:i w:val="0"/>
           <w:sz w:val="22"/>
         </w:rPr>
-        <w:t>: pipeline Azure DevOps bloqueia merge se testes unitarios falharem; cobertura monitorada a cada sprint.</w:t>
+        <w:t>: pipeline Azure DevOps bloqueia merge se testes unitários falharem; cobertura monitorada a cada sprint.</w:t>
       </w:r>
     </w:p>
     <w:p>
@@ -1685,7 +2397,7 @@
           <w:i w:val="0"/>
           <w:sz w:val="22"/>
         </w:rPr>
-        <w:t>: RAC-AASP01-001 mantido e atualizado com riscos identificados, probabilidade, impacto e acoes de mitigacao.</w:t>
+        <w:t>: RAC-AASP01-001 mantido e atualizado com riscos identificados, probabilidade, impacto e acoes de mitigação.</w:t>
       </w:r>
     </w:p>
     <w:p>
@@ -1700,7 +2412,7 @@
           <w:i w:val="0"/>
           <w:sz w:val="22"/>
         </w:rPr>
-        <w:t>Comunicacao semanal com o cliente</w:t>
+        <w:t>Comunicação semanal com o cliente</w:t>
       </w:r>
       <w:r>
         <w:rPr>
@@ -1709,7 +2421,7 @@
           <w:i w:val="0"/>
           <w:sz w:val="22"/>
         </w:rPr>
-        <w:t>: reunioes de acompanhamento com Marcos Turnes (PO AASP) realizadas semanalmente durante toda a execucao do projeto.</w:t>
+        <w:t>: reunioes de acompanhamento com Marcos Turnes (PO AASP) realizadas semanalmente durante toda a execução do projeto.</w:t>
       </w:r>
     </w:p>
     <w:p>
@@ -1748,7 +2460,7 @@
           <w:i w:val="0"/>
           <w:sz w:val="22"/>
         </w:rPr>
-        <w:t>Formalizacao de Change Requests</w:t>
+        <w:t>Formalização de Change Requests</w:t>
       </w:r>
       <w:r>
         <w:rPr>
@@ -1757,7 +2469,7 @@
           <w:i w:val="0"/>
           <w:sz w:val="22"/>
         </w:rPr>
-        <w:t>: qualquer mudanca de escopo registrada em CR-AASP01-001 antes de ser implementada.</w:t>
+        <w:t>: qualquer mudança de escopo registrada em CR-AASP01-001 antes de ser implementada.</w:t>
       </w:r>
     </w:p>
     <w:p>
@@ -1772,7 +2484,7 @@
           <w:i w:val="0"/>
           <w:sz w:val="22"/>
         </w:rPr>
-        <w:t>Baselines de configuracao</w:t>
+        <w:t>Baselines de configuração</w:t>
       </w:r>
       <w:r>
         <w:rPr>
@@ -1794,7 +2506,7 @@
         </w:pBdr>
       </w:pPr>
       <w:r>
-        <w:t>4. Impacto das adaptacoes no projeto</w:t>
+        <w:t>5. Impacto das adaptações no projeto</w:t>
       </w:r>
     </w:p>
     <w:tbl>
@@ -1842,7 +2554,7 @@
                 <w:color w:val="FFFFFF"/>
                 <w:sz w:val="20"/>
               </w:rPr>
-              <w:t># Adaptacao</w:t>
+              <w:t># Adaptação</w:t>
             </w:r>
           </w:p>
         </w:tc>
@@ -1896,7 +2608,7 @@
                 <w:color w:val="FFFFFF"/>
                 <w:sz w:val="20"/>
               </w:rPr>
-              <w:t>Mitigacao adotada</w:t>
+              <w:t>Mitigação adotada</w:t>
             </w:r>
           </w:p>
         </w:tc>
@@ -2059,7 +2771,7 @@
                 <w:i w:val="0"/>
                 <w:sz w:val="20"/>
               </w:rPr>
-              <w:t>Abraão revisou estimativas ao final de cada sprint e ajustou o PLA-AASP01-001; formalizacao completa a partir da S3</w:t>
+              <w:t>Abraão Oliveira revisou estimativas ao final de cada sprint e ajustou o PLA-AASP01-001; formalização completa a partir da S3</w:t>
             </w:r>
           </w:p>
         </w:tc>
@@ -2116,7 +2828,7 @@
                 <w:i w:val="0"/>
                 <w:sz w:val="20"/>
               </w:rPr>
-              <w:t>Implementacao da integracao com temis iniciada sem contrato definitivo</w:t>
+              <w:t>Implementação da integração com temis iniciada sem contrato definitivo</w:t>
             </w:r>
           </w:p>
         </w:tc>
@@ -2142,7 +2854,7 @@
                 <w:i w:val="0"/>
                 <w:sz w:val="20"/>
               </w:rPr>
-              <w:t>Interfaces de integracao projetadas com baixo acoplamento; adaptacao ao contrato real custou apenas ajuste de payload na Sprint 2</w:t>
+              <w:t>Interfaces de integração projetadas com baixo acoplamento; adaptação ao contrato real custou apenas ajuste de payload na Sprint 2</w:t>
             </w:r>
           </w:p>
         </w:tc>
@@ -2197,7 +2909,7 @@
                 <w:i w:val="0"/>
                 <w:sz w:val="20"/>
               </w:rPr>
-              <w:t>Bugs de ambiente nao detectados na Sprint 1 por ausencia de homologacao real</w:t>
+              <w:t>Bugs de ambiente não detectados na Sprint 1 por ausência de homologação real</w:t>
             </w:r>
           </w:p>
         </w:tc>
@@ -2222,7 +2934,7 @@
                 <w:i w:val="0"/>
                 <w:sz w:val="20"/>
               </w:rPr>
-              <w:t>Testes unitarios com cobertura estimada de 85% (22/26 metodos); bugs de ambiente identificados e corrigidos no inicio da Sprint 2</w:t>
+              <w:t>Testes unitários com cobertura estimada de 85% (22/26 métodos); bugs de ambiente identificados e corrigidos no início da Sprint 2</w:t>
             </w:r>
           </w:p>
         </w:tc>
@@ -2279,7 +2991,7 @@
                 <w:i w:val="0"/>
                 <w:sz w:val="20"/>
               </w:rPr>
-              <w:t>Maior esforco de coordenacao entre Timeware e AASP nos ciclos de teste</w:t>
+              <w:t>Maior esforco de coordenação entre Timeware e AASP nos ciclos de teste</w:t>
             </w:r>
           </w:p>
         </w:tc>
@@ -2305,7 +3017,7 @@
                 <w:i w:val="0"/>
                 <w:sz w:val="20"/>
               </w:rPr>
-              <w:t>Roteiros de teste (CTQ-AASP01-001) preparados com antecedencia; sessoes de teste agendadas com Leonardo Francisco Pereira; resultados registrados formalmente</w:t>
+              <w:t>Roteiros de teste (CTQ-AASP01-001) preparados com antecedência; sessões de teste agendadas com Leonardo Francisco Pereira; resultados registrados formalmente</w:t>
             </w:r>
           </w:p>
         </w:tc>
@@ -2360,7 +3072,7 @@
                 <w:i w:val="0"/>
                 <w:sz w:val="20"/>
               </w:rPr>
-              <w:t>PRs como unica fonte de especificacao de baixo nivel aumenta dependencia do Azure DevOps</w:t>
+              <w:t>PRs como única fonte de especificação de baixo nível aumenta dependência do Azure DevOps</w:t>
             </w:r>
           </w:p>
         </w:tc>
@@ -2468,7 +3180,7 @@
                 <w:i w:val="0"/>
                 <w:sz w:val="20"/>
               </w:rPr>
-              <w:t>Gate de CI/CD obrigatorio (build + testes + analise estatica SonarQube); checklist de code review padrao Timeware aplicado em todos os PRs</w:t>
+              <w:t>Gate de CI/CD obrigatório (build + testes + análise estática SonarQube); checklist de code review padrão Timeware aplicado em todos os PRs</w:t>
             </w:r>
           </w:p>
         </w:tc>
@@ -2523,7 +3235,7 @@
                 <w:i w:val="0"/>
                 <w:sz w:val="20"/>
               </w:rPr>
-              <w:t>Acumulo de papeis por Cezar Hiraki aumenta risco de sobrecarga e ponto unico de falha</w:t>
+              <w:t>Acumulo de papeis por Cézar Velázquez aumenta risco de sobrecarga e ponto único de falha</w:t>
             </w:r>
           </w:p>
         </w:tc>
@@ -2548,7 +3260,7 @@
                 <w:i w:val="0"/>
                 <w:sz w:val="20"/>
               </w:rPr>
-              <w:t>Cronograma previsto com buffer de 20%; Renan Kiyoshi preparado para assumir atividades de GCO em caso de indisponibilidade de Cezar</w:t>
+              <w:t>Cronograma previsto com buffer de 20%; Renan Kioshi preparado para assumir atividades de GCO em caso de indisponibilidade de Cézar</w:t>
             </w:r>
           </w:p>
         </w:tc>
@@ -2569,7 +3281,7 @@
         </w:pBdr>
       </w:pPr>
       <w:r>
-        <w:t>Historico de revisoes</w:t>
+        <w:t>Histórico de revisões</w:t>
       </w:r>
     </w:p>
     <w:tbl>
@@ -2617,7 +3329,7 @@
                 <w:i w:val="0"/>
                 <w:sz w:val="20"/>
               </w:rPr>
-              <w:t>Versao</w:t>
+              <w:t>Versão</w:t>
             </w:r>
           </w:p>
         </w:tc>
@@ -2695,7 +3407,7 @@
                 <w:i w:val="0"/>
                 <w:sz w:val="20"/>
               </w:rPr>
-              <w:t>Descricao</w:t>
+              <w:t>Descrição</w:t>
             </w:r>
           </w:p>
         </w:tc>
@@ -2776,7 +3488,7 @@
                 <w:i w:val="0"/>
                 <w:sz w:val="20"/>
               </w:rPr>
-              <w:t>Abraão</w:t>
+              <w:t>Abraão Oliveira</w:t>
             </w:r>
           </w:p>
         </w:tc>
@@ -2801,7 +3513,7 @@
                 <w:i w:val="0"/>
                 <w:sz w:val="20"/>
               </w:rPr>
-              <w:t>Versao inicial</w:t>
+              <w:t>Versão inicial</w:t>
             </w:r>
           </w:p>
         </w:tc>

</xml_diff>

<commit_message>
docs(AASP01): alinha a API real (GerenciarGruposController, HTTP 200/400, funcao), Azure->GitLab (MR !1-!7) e ortografia PT-BR
</commit_message>
<xml_diff>
--- a/mps-nivel-c/oficial/04_registros/AASP_Gerenciador/AASP01_Grupos-Usuarios/ADAP-AASP01-001_Registro-de-Adaptacao.docx
+++ b/mps-nivel-c/oficial/04_registros/AASP_Gerenciador/AASP01_Grupos-Usuarios/ADAP-AASP01-001_Registro-de-Adaptacao.docx
@@ -21,7 +21,7 @@
           <w:color w:val="003366"/>
           <w:sz w:val="36"/>
         </w:rPr>
-        <w:t>REGISTRO DE ADAPTACAO AO PROCESSO-PADRAO — AASP GERENCIADOR · GRUPOS DE USUARIOS</w:t>
+        <w:t>REGISTRO DE ADAPTAÇÃO AO PROCESSO-PADRÃO — AASP GERENCIADOR · GRUPOS DE USUÁRIOS</w:t>
       </w:r>
     </w:p>
     <w:p>
@@ -226,7 +226,7 @@
                 <w:i w:val="0"/>
                 <w:sz w:val="20"/>
               </w:rPr>
-              <w:t>Grupos de Usuarios — AASP Gerenciador</w:t>
+              <w:t>Grupos de Usuários — AASP Gerenciador</w:t>
             </w:r>
           </w:p>
         </w:tc>
@@ -282,7 +282,7 @@
                 <w:i w:val="0"/>
                 <w:sz w:val="20"/>
               </w:rPr>
-              <w:t>AASP — Associacao dos Advogados de Sao Paulo</w:t>
+              <w:t>AASP — Associação dos Advogados de São Paulo</w:t>
             </w:r>
           </w:p>
         </w:tc>
@@ -313,7 +313,7 @@
                 <w:i w:val="0"/>
                 <w:sz w:val="20"/>
               </w:rPr>
-              <w:t>Versao</w:t>
+              <w:t>Versão</w:t>
             </w:r>
           </w:p>
         </w:tc>
@@ -506,7 +506,7 @@
                 <w:i w:val="0"/>
                 <w:sz w:val="20"/>
               </w:rPr>
-              <w:t>ADAP (evidencia de projeto)</w:t>
+              <w:t>ADAP (evidência de projeto)</w:t>
             </w:r>
           </w:p>
         </w:tc>
@@ -541,7 +541,7 @@
           <w:i w:val="0"/>
           <w:sz w:val="22"/>
         </w:rPr>
-        <w:t>Registrar formalmente as adaptacoes realizadas ao processo-padrao Timeware para a execucao do projeto AASP01 — Grupos de Usuarios (ms.auxo.gruposusuarios). As adaptacoes descritas neste documento foram avaliadas e aprovadas pelo Gerente de Projeto antes do inicio das atividades de desenvolvimento, conforme exigido pelo processo de Adaptacao (ADAP) do modelo MPS-SW nivel C.</w:t>
+        <w:t>Registrar formalmente as adaptações realizadas ao processo-padrão Timeware para a execução do projeto AASP01 — Grupos de Usuários (ms.auxo.gruposusuarios). As adaptações descritas neste documento foram avaliadas e aprovadas pelo Gerente de Projeto antes do inicio das atividades de desenvolvimento, conforme exigido pelo processo de Adaptação (ADAP) do modelo MPS-SW nível C.</w:t>
       </w:r>
     </w:p>
     <w:p>
@@ -555,7 +555,7 @@
           <w:i w:val="0"/>
           <w:sz w:val="22"/>
         </w:rPr>
-        <w:t>Toda adaptacao foi motivada por restricoes reais de contexto — equipe enxuta, legado nao documentado, restricoes do cliente — e nao implica reducao de qualidade nos produtos entregues. Os mecanismos de mitigacao associados a cada adaptacao garantem que os objetivos do processo-padrao sejam atingidos por meios alternativos.</w:t>
+        <w:t>Toda adaptação foi motivada por restrições reais de contexto — equipe enxuta, legado não documentado, restrições do cliente — e não implica redução de qualidade nos produtos entregues. Os mecanismos de mitigação associados a cada adaptação garantem que os objetivos do processo-padrão sejam atingidos por meios alternativos.</w:t>
       </w:r>
     </w:p>
     <w:p>
@@ -568,7 +568,7 @@
         </w:pBdr>
       </w:pPr>
       <w:r>
-        <w:t>2. Adaptacoes aplicadas</w:t>
+        <w:t>2. Adaptações aplicadas</w:t>
       </w:r>
     </w:p>
     <w:tbl>
@@ -644,7 +644,7 @@
                 <w:color w:val="FFFFFF"/>
                 <w:sz w:val="20"/>
               </w:rPr>
-              <w:t>Item do processo-padrao</w:t>
+              <w:t>Item do processo-padrão</w:t>
             </w:r>
           </w:p>
         </w:tc>
@@ -671,7 +671,7 @@
                 <w:color w:val="FFFFFF"/>
                 <w:sz w:val="20"/>
               </w:rPr>
-              <w:t>Decisao de adaptacao</w:t>
+              <w:t>Decisão de adaptação</w:t>
             </w:r>
           </w:p>
         </w:tc>
@@ -755,7 +755,7 @@
                 <w:i w:val="0"/>
                 <w:sz w:val="20"/>
               </w:rPr>
-              <w:t>Definicao completa de requisitos antes do inicio do desenvolvimento</w:t>
+              <w:t>Definição completa de requisitos antes do inicio do desenvolvimento</w:t>
             </w:r>
           </w:p>
         </w:tc>
@@ -807,7 +807,7 @@
                 <w:i w:val="0"/>
                 <w:sz w:val="20"/>
               </w:rPr>
-              <w:t>Banco auxo3 legado com schema nao documentado; requisitos precisaram ser descobertos explorando o banco e o codigo existente do Gerenciador. Impossivel elicitar todos os requisitos upfront sem acesso ao ambiente de producao.</w:t>
+              <w:t>Banco auxo3 legado com schema não documentado; requisitos precisaram ser descobertos explorando o banco e o código existente do Gerenciador. Impossível elicitar todos os requisitos upfront sem acesso ao ambiente de produção.</w:t>
             </w:r>
           </w:p>
         </w:tc>
@@ -887,7 +887,7 @@
                 <w:i w:val="0"/>
                 <w:sz w:val="20"/>
               </w:rPr>
-              <w:t>Sprints S1 e S2 conduzidas com planejamento agil via Microsoft Teams e notas informais; formalizacao completa a partir da S3</w:t>
+              <w:t>Sprints S1 e S2 conduzidas com planejamento ágil via Microsoft Teams e notas informais; formalização completa a partir da S3</w:t>
             </w:r>
           </w:p>
         </w:tc>
@@ -912,7 +912,7 @@
                 <w:i w:val="0"/>
                 <w:sz w:val="20"/>
               </w:rPr>
-              <w:t>Equipe enxuta composta por 3 desenvolvedores (Renan Kiyoshi, Henry Komatsu e Mateus Veloso); overhead documental de um planning formal nas primeiras sprints comprometia a cadencia de entrega dentro do prazo contratado.</w:t>
+              <w:t>Equipe enxuta composta por 3 desenvolvedores (Renan Kiyoshi, Henry Komatsu e Mateus Veloso); overhead documental de um planning formal nas primeiras sprints comprometia a cadência de entrega dentro do prazo contratado.</w:t>
             </w:r>
           </w:p>
         </w:tc>
@@ -969,7 +969,7 @@
                 <w:i w:val="0"/>
                 <w:sz w:val="20"/>
               </w:rPr>
-              <w:t>Design de integracao completo antes da implementacao</w:t>
+              <w:t>Design de integração completo antes da implementação</w:t>
             </w:r>
           </w:p>
         </w:tc>
@@ -995,7 +995,7 @@
                 <w:i w:val="0"/>
                 <w:sz w:val="20"/>
               </w:rPr>
-              <w:t>Plano de Integracao (ITP-AASP01-001) definido iterativamente; detalhes do contrato de API acordados no inicio da Sprint 2</w:t>
+              <w:t>Plano de Integração (ITP-AASP01-001) definido iterativamente; detalhes do contrato de API acordados no inicio da Sprint 2</w:t>
             </w:r>
           </w:p>
         </w:tc>
@@ -1021,7 +1021,7 @@
                 <w:i w:val="0"/>
                 <w:sz w:val="20"/>
               </w:rPr>
-              <w:t>O contrato de API do microsservico ms.temis.vinculos (banco temis3) foi disponibilizado pelo time do cliente somente no inicio da Sprint 2 (09/06/2026); especificacao previa seria baseada em suposicoes sem validade.</w:t>
+              <w:t>O contrato de API do microsserviço ms.temis.vinculos (banco temis3) foi disponibilizado pelo time do cliente somente no inicio da Sprint 2 (09/06/2026); especificação previa seria baseada em suposições sem validade.</w:t>
             </w:r>
           </w:p>
         </w:tc>
@@ -1076,7 +1076,7 @@
                 <w:i w:val="0"/>
                 <w:sz w:val="20"/>
               </w:rPr>
-              <w:t>Ambiente de homologacao independente desde o inicio do projeto</w:t>
+              <w:t>Ambiente de homologação independente desde o inicio do projeto</w:t>
             </w:r>
           </w:p>
         </w:tc>
@@ -1101,7 +1101,7 @@
                 <w:i w:val="0"/>
                 <w:sz w:val="20"/>
               </w:rPr>
-              <w:t>Ambiente de homologacao AASP disponibilizado somente a partir da Sprint 2 (09/06/2026); Sprint 1 executada com banco local SQL Server Express</w:t>
+              <w:t>Ambiente de homologação AASP disponibilizado somente a partir da Sprint 2 (09/06/2026); Sprint 1 executada com banco local SQL Server Express</w:t>
             </w:r>
           </w:p>
         </w:tc>
@@ -1126,7 +1126,7 @@
                 <w:i w:val="0"/>
                 <w:sz w:val="20"/>
               </w:rPr>
-              <w:t>Restricao imposta pelo cliente AASP; o time da AASP precisava preparar o ambiente de homologacao em paralelo ao desenvolvimento. O time Timeware trabalhou com instancia local para nao bloquear entregas.</w:t>
+              <w:t>Restrição imposta pelo cliente AASP; o time da AASP precisava preparar o ambiente de homologação em paralelo ao desenvolvimento. O time Timeware trabalhou com instancia local para não bloquear entregas.</w:t>
             </w:r>
           </w:p>
         </w:tc>
@@ -1235,7 +1235,7 @@
                 <w:i w:val="0"/>
                 <w:sz w:val="20"/>
               </w:rPr>
-              <w:t>Cliente AASP exigiu participacao direta nos testes de aceite como condicao contratual. Os roteiros foram revisados em conjunto (CTQ-AASP01-001) e os resultados registrados formalmente (REL-VV-AASP01-001).</w:t>
+              <w:t>Cliente AASP exigiu participação direta nos testes de aceite como condição contratual. Os roteiros foram revisados em conjunto (CTQ-AASP01-001) e os resultados registrados formalmente (REL-VV-AASP01-001).</w:t>
             </w:r>
           </w:p>
         </w:tc>
@@ -1290,7 +1290,7 @@
                 <w:i w:val="0"/>
                 <w:sz w:val="20"/>
               </w:rPr>
-              <w:t>Plano de Construcao e Producao (PCP) com especificacoes de baixo nivel completas antes do desenvolvimento</w:t>
+              <w:t>Plano de Construção e Produção (PCP) com especificações de baixo nível completas antes do desenvolvimento</w:t>
             </w:r>
           </w:p>
         </w:tc>
@@ -1315,7 +1315,7 @@
                 <w:i w:val="0"/>
                 <w:sz w:val="20"/>
               </w:rPr>
-              <w:t>PCP elaborado no nivel de decisoes arquiteturais e padroes de implementacao; detalhes de baixo nivel registrados nos Pull Requests #11 a #15</w:t>
+              <w:t>PCP elaborado no nível de decisões arquiteturais e padrões de implementação; detalhes de baixo nível registrados nos Merge Requests !1 a !5</w:t>
             </w:r>
           </w:p>
         </w:tc>
@@ -1340,7 +1340,7 @@
                 <w:i w:val="0"/>
                 <w:sz w:val="20"/>
               </w:rPr>
-              <w:t>Equipe enxuta; duplicar especificacoes de baixo nivel no PCP e nos PRs geraria retrabalho documental sem agregar valor. Os PRs do Azure DevOps servem como documentacao viva, rastreavel e revisada.</w:t>
+              <w:t>Equipe enxuta; duplicar especificações de baixo nível no PCP e nos MRs geraria retrabalho documental sem agregar valor. Os MRs do GitLab servem como documentação viva, rastreável e revisada.</w:t>
             </w:r>
           </w:p>
         </w:tc>
@@ -1397,7 +1397,7 @@
                 <w:i w:val="0"/>
                 <w:sz w:val="20"/>
               </w:rPr>
-              <w:t>Code review com dois revisores independentes para cada Pull Request</w:t>
+              <w:t>Code review com dois revisores independentes para cada Merge Request</w:t>
             </w:r>
           </w:p>
         </w:tc>
@@ -1423,7 +1423,7 @@
                 <w:i w:val="0"/>
                 <w:sz w:val="20"/>
               </w:rPr>
-              <w:t>Revisor unico (Cezar Hiraki como Tech Lead) nos PRs de codigo critico; revisao cruzada entre os desenvolvedores (Renan, Henry e Mateus Veloso) nos PRs de menor risco</w:t>
+              <w:t>Revisor único (Cezar Hiraki como Tech Lead) nos MRs de código critico; revisão cruzada entre os desenvolvedores (Renan, Henry e Mateus Veloso) nos MRs de menor risco</w:t>
             </w:r>
           </w:p>
         </w:tc>
@@ -1449,7 +1449,7 @@
                 <w:i w:val="0"/>
                 <w:sz w:val="20"/>
               </w:rPr>
-              <w:t>Equipe de 3 desenvolvedores; exigir dois revisores independentes inviabilizaria o fluxo de trabalho. Cezar Hiraki revisa todos os PRs dos desenvolvedores. Gate de CI/CD obrigatorio compensa parcialmente a reducao de revisores.</w:t>
+              <w:t>Equipe de 3 desenvolvedores; exigir dois revisores independentes inviabilizaria o fluxo de trabalho. Cezar Hiraki revisa todos os MRs dos desenvolvedores. Gate de CI/CD obrigatório compensa parcialmente a redução de revisores.</w:t>
             </w:r>
           </w:p>
         </w:tc>
@@ -1529,7 +1529,7 @@
                 <w:i w:val="0"/>
                 <w:sz w:val="20"/>
               </w:rPr>
-              <w:t>Cezar Hiraki acumula os papeis de Arquiteto, Tech Lead, DevOps, Revisor e GCO; a Gerencia de Projeto e exercida por Abraão</w:t>
+              <w:t>Cezar Hiraki acumula os papeis de Arquiteto, Tech Lead, DevOps, Revisor e GCO; a Gerência de Projeto e exercida por Abraão</w:t>
             </w:r>
           </w:p>
         </w:tc>
@@ -1554,7 +1554,7 @@
                 <w:i w:val="0"/>
                 <w:sz w:val="20"/>
               </w:rPr>
-              <w:t>Contrato previsto para equipe enxuta de desenvolvimento; acumulo de papeis por Cezar Hiraki viabiliza a operacao dentro do orçamento contratado. As responsabilidades de cada papel sao exercidas formalmente, ainda que pela mesma pessoa.</w:t>
+              <w:t>Contrato previsto para equipe enxuta de desenvolvimento; acumulo de papeis por Cezar Hiraki viabiliza a operação dentro do orçamento contratado. As responsabilidades de cada papel são exercidas formalmente, ainda que pela mesma pessoa.</w:t>
             </w:r>
           </w:p>
         </w:tc>
@@ -1575,7 +1575,7 @@
         </w:pBdr>
       </w:pPr>
       <w:r>
-        <w:t>3. Itens sem adaptacao (processo-padrao mantido integralmente)</w:t>
+        <w:t>3. Itens sem adaptação (processo-padrão mantido integralmente)</w:t>
       </w:r>
     </w:p>
     <w:p>
@@ -1589,7 +1589,7 @@
           <w:i w:val="0"/>
           <w:sz w:val="22"/>
         </w:rPr>
-        <w:t>Os itens abaixo seguiram o processo-padrao Timeware sem qualquer adaptacao:</w:t>
+        <w:t>Os itens abaixo seguiram o processo-padrão Timeware sem qualquer adaptação:</w:t>
       </w:r>
     </w:p>
     <w:p>
@@ -1604,7 +1604,7 @@
           <w:i w:val="0"/>
           <w:sz w:val="22"/>
         </w:rPr>
-        <w:t>Controle de versao com Git</w:t>
+        <w:t>Controle de versão com Git</w:t>
       </w:r>
       <w:r>
         <w:rPr>
@@ -1613,7 +1613,7 @@
           <w:i w:val="0"/>
           <w:sz w:val="22"/>
         </w:rPr>
-        <w:t>: todo codigo versionado no Azure DevOps; branching Git Flow (main / develop / feature/ag-{id} / release/*) aplicado desde o primeiro commit.</w:t>
+        <w:t>: todo código versionado no GitLab; branching Git Flow (main / develop / feature/ag-{id} / release/*) aplicado desde o primeiro commit.</w:t>
       </w:r>
     </w:p>
     <w:p>
@@ -1628,7 +1628,7 @@
           <w:i w:val="0"/>
           <w:sz w:val="22"/>
         </w:rPr>
-        <w:t>Pull Request obrigatorio para merge</w:t>
+        <w:t>Merge Request obrigatório para merge</w:t>
       </w:r>
       <w:r>
         <w:rPr>
@@ -1637,7 +1637,7 @@
           <w:i w:val="0"/>
           <w:sz w:val="22"/>
         </w:rPr>
-        <w:t>: nenhum codigo integrado a develop ou main sem PR aprovado, independentemente do tamanho da mudanca.</w:t>
+        <w:t>: nenhum código integrado a develop ou main sem MR aprovado, independentemente do tamanho da mudança.</w:t>
       </w:r>
     </w:p>
     <w:p>
@@ -1661,7 +1661,7 @@
           <w:i w:val="0"/>
           <w:sz w:val="22"/>
         </w:rPr>
-        <w:t>: pipeline Azure DevOps bloqueia merge se testes unitarios falharem; cobertura monitorada a cada sprint.</w:t>
+        <w:t>: pipeline GitLab CI bloqueia merge se testes unitarios falharem; cobertura monitorada a cada sprint.</w:t>
       </w:r>
     </w:p>
     <w:p>
@@ -1685,7 +1685,7 @@
           <w:i w:val="0"/>
           <w:sz w:val="22"/>
         </w:rPr>
-        <w:t>: RAC-AASP01-001 mantido e atualizado com riscos identificados, probabilidade, impacto e acoes de mitigacao.</w:t>
+        <w:t>: RAC-AASP01-001 mantido e atualizado com riscos identificados, probabilidade, impacto e ações de mitigação.</w:t>
       </w:r>
     </w:p>
     <w:p>
@@ -1700,7 +1700,7 @@
           <w:i w:val="0"/>
           <w:sz w:val="22"/>
         </w:rPr>
-        <w:t>Comunicacao semanal com o cliente</w:t>
+        <w:t>Comunicação semanal com o cliente</w:t>
       </w:r>
       <w:r>
         <w:rPr>
@@ -1709,7 +1709,7 @@
           <w:i w:val="0"/>
           <w:sz w:val="22"/>
         </w:rPr>
-        <w:t>: reunioes de acompanhamento com Marcos Turnes (PO AASP) realizadas semanalmente durante toda a execucao do projeto.</w:t>
+        <w:t>: reuniões de acompanhamento com Marcos Turnes (PO AASP) realizadas semanalmente durante toda a execução do projeto.</w:t>
       </w:r>
     </w:p>
     <w:p>
@@ -1733,7 +1733,7 @@
           <w:i w:val="0"/>
           <w:sz w:val="22"/>
         </w:rPr>
-        <w:t>: matriz RASTR-AASP01-001 mantida associando cada requisito (AG-20 a AG-25) aos casos de teste e PRs correspondentes.</w:t>
+        <w:t>: matriz RASTR-AASP01-001 mantida associando cada requisito (AG-20 a AG-25) aos casos de teste e MRs correspondentes.</w:t>
       </w:r>
     </w:p>
     <w:p>
@@ -1748,7 +1748,7 @@
           <w:i w:val="0"/>
           <w:sz w:val="22"/>
         </w:rPr>
-        <w:t>Formalizacao de Change Requests</w:t>
+        <w:t>Formalização de Change Requests</w:t>
       </w:r>
       <w:r>
         <w:rPr>
@@ -1757,7 +1757,7 @@
           <w:i w:val="0"/>
           <w:sz w:val="22"/>
         </w:rPr>
-        <w:t>: qualquer mudanca de escopo registrada em CR-AASP01-001 antes de ser implementada.</w:t>
+        <w:t>: qualquer mudança de escopo registrada em CR-AASP01-001 antes de ser implementada.</w:t>
       </w:r>
     </w:p>
     <w:p>
@@ -1772,7 +1772,7 @@
           <w:i w:val="0"/>
           <w:sz w:val="22"/>
         </w:rPr>
-        <w:t>Baselines de configuracao</w:t>
+        <w:t>Baselines de configuração</w:t>
       </w:r>
       <w:r>
         <w:rPr>
@@ -1794,7 +1794,7 @@
         </w:pBdr>
       </w:pPr>
       <w:r>
-        <w:t>4. Impacto das adaptacoes no projeto</w:t>
+        <w:t>4. Impacto das adaptações no projeto</w:t>
       </w:r>
     </w:p>
     <w:tbl>
@@ -1842,7 +1842,7 @@
                 <w:color w:val="FFFFFF"/>
                 <w:sz w:val="20"/>
               </w:rPr>
-              <w:t># Adaptacao</w:t>
+              <w:t># Adaptação</w:t>
             </w:r>
           </w:p>
         </w:tc>
@@ -1896,7 +1896,7 @@
                 <w:color w:val="FFFFFF"/>
                 <w:sz w:val="20"/>
               </w:rPr>
-              <w:t>Mitigacao adotada</w:t>
+              <w:t>Mitigação adotada</w:t>
             </w:r>
           </w:p>
         </w:tc>
@@ -1979,7 +1979,7 @@
                 <w:i w:val="0"/>
                 <w:sz w:val="20"/>
               </w:rPr>
-              <w:t>Reunioes semanais com PO Marcos Turnes para validar requisitos emergentes; backlog ajustado a cada sprint</w:t>
+              <w:t>Reuniões semanais com PO Marcos Turnes para validar requisitos emergentes; backlog ajustado a cada sprint</w:t>
             </w:r>
           </w:p>
         </w:tc>
@@ -2059,7 +2059,7 @@
                 <w:i w:val="0"/>
                 <w:sz w:val="20"/>
               </w:rPr>
-              <w:t>Abraão revisou estimativas ao final de cada sprint e ajustou o PLA-AASP01-001; formalizacao completa a partir da S3</w:t>
+              <w:t>Abraão revisou estimativas ao final de cada sprint e ajustou o PLA-AASP01-001; formalização completa a partir da S3</w:t>
             </w:r>
           </w:p>
         </w:tc>
@@ -2116,7 +2116,7 @@
                 <w:i w:val="0"/>
                 <w:sz w:val="20"/>
               </w:rPr>
-              <w:t>Implementacao da integracao com temis iniciada sem contrato definitivo</w:t>
+              <w:t>Implementação da integração com temis iniciada sem contrato definitivo</w:t>
             </w:r>
           </w:p>
         </w:tc>
@@ -2142,7 +2142,7 @@
                 <w:i w:val="0"/>
                 <w:sz w:val="20"/>
               </w:rPr>
-              <w:t>Interfaces de integracao projetadas com baixo acoplamento; adaptacao ao contrato real custou apenas ajuste de payload na Sprint 2</w:t>
+              <w:t>Interfaces de integração projetadas com baixo acoplamento; adaptação ao contrato real custou apenas ajuste de payload na Sprint 2</w:t>
             </w:r>
           </w:p>
         </w:tc>
@@ -2197,7 +2197,7 @@
                 <w:i w:val="0"/>
                 <w:sz w:val="20"/>
               </w:rPr>
-              <w:t>Bugs de ambiente nao detectados na Sprint 1 por ausencia de homologacao real</w:t>
+              <w:t>Bugs de ambiente não detectados na Sprint 1 por ausência de homologação real</w:t>
             </w:r>
           </w:p>
         </w:tc>
@@ -2222,7 +2222,7 @@
                 <w:i w:val="0"/>
                 <w:sz w:val="20"/>
               </w:rPr>
-              <w:t>Testes unitarios com cobertura estimada de 85% (22/26 metodos); bugs de ambiente identificados e corrigidos no inicio da Sprint 2</w:t>
+              <w:t>Testes unitarios com cobertura estimada de 85% (22/26 métodos); bugs de ambiente identificados e corrigidos no inicio da Sprint 2</w:t>
             </w:r>
           </w:p>
         </w:tc>
@@ -2279,7 +2279,7 @@
                 <w:i w:val="0"/>
                 <w:sz w:val="20"/>
               </w:rPr>
-              <w:t>Maior esforco de coordenacao entre Timeware e AASP nos ciclos de teste</w:t>
+              <w:t>Maior esforço de coordenação entre Timeware e AASP nos ciclos de teste</w:t>
             </w:r>
           </w:p>
         </w:tc>
@@ -2305,7 +2305,7 @@
                 <w:i w:val="0"/>
                 <w:sz w:val="20"/>
               </w:rPr>
-              <w:t>Roteiros de teste (CTQ-AASP01-001) preparados com antecedencia; sessoes de teste agendadas com Leonardo Francisco Pereira; resultados registrados formalmente</w:t>
+              <w:t>Roteiros de teste (CTQ-AASP01-001) preparados com antecedência; sessões de teste agendadas com Leonardo Francisco Pereira; resultados registrados formalmente</w:t>
             </w:r>
           </w:p>
         </w:tc>
@@ -2360,7 +2360,7 @@
                 <w:i w:val="0"/>
                 <w:sz w:val="20"/>
               </w:rPr>
-              <w:t>PRs como unica fonte de especificacao de baixo nivel aumenta dependencia do Azure DevOps</w:t>
+              <w:t>MRs como única fonte de especificação de baixo nível aumenta dependência do GitLab</w:t>
             </w:r>
           </w:p>
         </w:tc>
@@ -2385,7 +2385,7 @@
                 <w:i w:val="0"/>
                 <w:sz w:val="20"/>
               </w:rPr>
-              <w:t>PRs exportados como PDF e arquivados no pacote documental MPS-SW a cada baseline</w:t>
+              <w:t>MRs exportados como PDF e arquivados no pacote documental MPS-SW a cada baseline</w:t>
             </w:r>
           </w:p>
         </w:tc>
@@ -2468,7 +2468,7 @@
                 <w:i w:val="0"/>
                 <w:sz w:val="20"/>
               </w:rPr>
-              <w:t>Gate de CI/CD obrigatorio (build + testes + analise estatica SonarQube); checklist de code review padrao Timeware aplicado em todos os PRs</w:t>
+              <w:t>Gate de CI/CD obrigatório (build + testes + análise estática SonarQube); checklist de code review padrão Timeware aplicado em todos os MRs</w:t>
             </w:r>
           </w:p>
         </w:tc>
@@ -2523,7 +2523,7 @@
                 <w:i w:val="0"/>
                 <w:sz w:val="20"/>
               </w:rPr>
-              <w:t>Acumulo de papeis por Cezar Hiraki aumenta risco de sobrecarga e ponto unico de falha</w:t>
+              <w:t>Acumulo de papeis por Cezar Hiraki aumenta risco de sobrecarga e ponto único de falha</w:t>
             </w:r>
           </w:p>
         </w:tc>
@@ -2569,7 +2569,7 @@
         </w:pBdr>
       </w:pPr>
       <w:r>
-        <w:t>Historico de revisoes</w:t>
+        <w:t>Histórico de revisões</w:t>
       </w:r>
     </w:p>
     <w:tbl>
@@ -2617,7 +2617,7 @@
                 <w:i w:val="0"/>
                 <w:sz w:val="20"/>
               </w:rPr>
-              <w:t>Versao</w:t>
+              <w:t>Versão</w:t>
             </w:r>
           </w:p>
         </w:tc>
@@ -2695,7 +2695,7 @@
                 <w:i w:val="0"/>
                 <w:sz w:val="20"/>
               </w:rPr>
-              <w:t>Descricao</w:t>
+              <w:t>Descrição</w:t>
             </w:r>
           </w:p>
         </w:tc>
@@ -2801,7 +2801,7 @@
                 <w:i w:val="0"/>
                 <w:sz w:val="20"/>
               </w:rPr>
-              <w:t>Versao inicial</w:t>
+              <w:t>Versão inicial</w:t>
             </w:r>
           </w:p>
         </w:tc>

</xml_diff>